<commit_message>
docs: update SRS v2.6, SDS v2.10, README, and plan for Week 7
Record Noor Week 7 QA completion on MASC sample, defer Rico holdout, and link new docs/week7 and validation artifacts.

Co-authored-by: Cursor <cursoragent@cursor.com>
</commit_message>
<xml_diff>
--- a/docs/updated_plan_v2.0.docx
+++ b/docs/updated_plan_v2.0.docx
@@ -62,7 +62,7 @@
           <w:b w:val="0"/>
           <w:sz w:val="22"/>
         </w:rPr>
-        <w:t xml:space="preserve"> 16 July 2026</w:t>
+        <w:t xml:space="preserve"> 20 July 2026</w:t>
       </w:r>
     </w:p>
     <w:p>
@@ -80,7 +80,23 @@
           <w:b w:val="0"/>
           <w:sz w:val="22"/>
         </w:rPr>
-        <w:t xml:space="preserve"> Week 6 assigned deliverables complete on </w:t>
+        <w:t xml:space="preserve"> Week 6 complete · </w:t>
+      </w:r>
+      <w:r>
+        <w:rPr>
+          <w:rFonts w:ascii="Calibri" w:hAnsi="Calibri" w:eastAsia="Calibri"/>
+          <w:b/>
+          <w:sz w:val="22"/>
+        </w:rPr>
+        <w:t>Week 7 (Noor) QA analysis complete</w:t>
+      </w:r>
+      <w:r>
+        <w:rPr>
+          <w:rFonts w:ascii="Calibri" w:hAnsi="Calibri" w:eastAsia="Calibri"/>
+          <w:b w:val="0"/>
+          <w:sz w:val="22"/>
+        </w:rPr>
+        <w:t xml:space="preserve"> on </w:t>
       </w:r>
       <w:r>
         <w:rPr>
@@ -97,16 +113,15 @@
           <w:b w:val="0"/>
           <w:sz w:val="22"/>
         </w:rPr>
-        <w:t xml:space="preserve"> (</w:t>
+        <w:t xml:space="preserve"> — rule/guideline summaries, validation logs; Rico holdout batch </w:t>
       </w:r>
       <w:r>
         <w:rPr>
-          <w:rFonts w:ascii="Consolas" w:hAnsi="Consolas" w:eastAsia="Consolas"/>
-          <w:b w:val="0"/>
-          <w:color w:val="1E3A5F"/>
-          <w:sz w:val="18"/>
+          <w:rFonts w:ascii="Calibri" w:hAnsi="Calibri" w:eastAsia="Calibri"/>
+          <w:b/>
+          <w:sz w:val="22"/>
         </w:rPr>
-        <w:t>995f6d31</w:t>
+        <w:t>deferred</w:t>
       </w:r>
       <w:r>
         <w:rPr>
@@ -114,7 +129,7 @@
           <w:b w:val="0"/>
           <w:sz w:val="22"/>
         </w:rPr>
-        <w:t>) — JWT/OTP/SMTP/Google auth, records, 40/40 eval sheet, Weeks 1–5 done; Friday demo walkthrough optional</w:t>
+        <w:t>; Salar/Ayesha Week 7 tasks pending</w:t>
       </w:r>
     </w:p>
     <w:p>
@@ -5858,6 +5873,58 @@
       </w:tr>
     </w:tbl>
     <w:p/>
+    <w:p>
+      <w:r>
+        <w:rPr>
+          <w:rFonts w:ascii="Calibri" w:hAnsi="Calibri" w:eastAsia="Calibri"/>
+          <w:b/>
+          <w:sz w:val="22"/>
+        </w:rPr>
+        <w:t>Week 7 Noor status (20 Jul):</w:t>
+      </w:r>
+      <w:r>
+        <w:rPr>
+          <w:rFonts w:ascii="Calibri" w:hAnsi="Calibri" w:eastAsia="Calibri"/>
+          <w:b w:val="0"/>
+          <w:sz w:val="22"/>
+        </w:rPr>
+        <w:t xml:space="preserve"> MASC 40-screen QA complete — </w:t>
+      </w:r>
+      <w:r>
+        <w:rPr>
+          <w:rFonts w:ascii="Consolas" w:hAnsi="Consolas" w:eastAsia="Consolas"/>
+          <w:b w:val="0"/>
+          <w:color w:val="1E3A5F"/>
+          <w:sz w:val="18"/>
+        </w:rPr>
+        <w:t>docs/week7/</w:t>
+      </w:r>
+      <w:r>
+        <w:rPr>
+          <w:rFonts w:ascii="Calibri" w:hAnsi="Calibri" w:eastAsia="Calibri"/>
+          <w:b w:val="0"/>
+          <w:sz w:val="22"/>
+        </w:rPr>
+        <w:t xml:space="preserve">, </w:t>
+      </w:r>
+      <w:r>
+        <w:rPr>
+          <w:rFonts w:ascii="Consolas" w:hAnsi="Consolas" w:eastAsia="Consolas"/>
+          <w:b w:val="0"/>
+          <w:color w:val="1E3A5F"/>
+          <w:sz w:val="18"/>
+        </w:rPr>
+        <w:t>outputs/week7_eval/</w:t>
+      </w:r>
+      <w:r>
+        <w:rPr>
+          <w:rFonts w:ascii="Calibri" w:hAnsi="Calibri" w:eastAsia="Calibri"/>
+          <w:b w:val="0"/>
+          <w:sz w:val="22"/>
+        </w:rPr>
+        <w:t>, validation logs. Rico holdout batch deferred to later in Week 7/8.</w:t>
+      </w:r>
+    </w:p>
     <w:p>
       <w:pPr>
         <w:pStyle w:val="Heading4"/>

</xml_diff>